<commit_message>
docs: generate exact 50-page reference project report in PDF and Word formats
</commit_message>
<xml_diff>
--- a/docs/HemoVault_Project_Report.docx
+++ b/docs/HemoVault_Project_Report.docx
@@ -14,7 +14,6 @@
     </w:p>
     <w:p>
       <w:pPr>
-        <w:pStyle w:val="Normal"/>
         <w:spacing w:after="200"/>
         <w:jc w:val="center"/>
       </w:pPr>
@@ -37,7 +36,7 @@
         <w:jc w:val="center"/>
       </w:pPr>
       <w:r>
-        <w:t xml:space="preserve">PRIYAN R (310624148072)</w:t>
+        <w:t xml:space="preserve">PRIYAN R   310624148072</w:t>
       </w:r>
     </w:p>
     <w:p>
@@ -46,7 +45,52 @@
         <w:jc w:val="center"/>
       </w:pPr>
       <w:r>
-        <w:t xml:space="preserve">in partial fulfillment for the award of the Degree of</w:t>
+        <w:t xml:space="preserve">in partial fulfillment of the requirements for the award of the Degree of</w:t>
+      </w:r>
+    </w:p>
+    <w:p>
+      <w:pPr>
+        <w:spacing w:after="200"/>
+        <w:jc w:val="center"/>
+      </w:pPr>
+      <w:r>
+        <w:t xml:space="preserve">BACHELOR OF ENGINEERING in COMPUTER SCIENCE AND ENGINEERING (ARTIFICIAL INTELLIGENCE AND MACHINE LEARNING)</w:t>
+      </w:r>
+    </w:p>
+    <w:p>
+      <w:pPr>
+        <w:spacing w:after="300"/>
+        <w:jc w:val="center"/>
+      </w:pPr>
+      <w:r>
+        <w:t xml:space="preserve">2311CSE503R - FULL STACK DEVELOPMENT</w:t>
+      </w:r>
+    </w:p>
+    <w:p>
+      <w:pPr>
+        <w:spacing w:after="50"/>
+        <w:jc w:val="center"/>
+      </w:pPr>
+      <w:r>
+        <w:t xml:space="preserve">EASWARI ENGINEERING COLLEGE</w:t>
+      </w:r>
+    </w:p>
+    <w:p>
+      <w:pPr>
+        <w:spacing w:after="50"/>
+        <w:jc w:val="center"/>
+      </w:pPr>
+      <w:r>
+        <w:t xml:space="preserve">An Autonomous Institution affiliated to Anna University</w:t>
+      </w:r>
+    </w:p>
+    <w:p>
+      <w:pPr>
+        <w:spacing w:after="200"/>
+        <w:jc w:val="center"/>
+      </w:pPr>
+      <w:r>
+        <w:t xml:space="preserve">Chennai</w:t>
       </w:r>
     </w:p>
     <w:p>
@@ -55,12 +99,84 @@
         <w:jc w:val="center"/>
       </w:pPr>
       <w:r>
-        <w:t xml:space="preserve">BACHELOR OF ENGINEERING in COMPUTER SCIENCE AND ENGINEERING (ARTIFICIAL INTELLIGENCE AND MACHINE LEARNING)</w:t>
+        <w:t xml:space="preserve">OCTOBER 2026</w:t>
+      </w:r>
+    </w:p>
+    <w:p>
+      <w:pPr>
+        <w:pStyle w:val="Heading1"/>
+        <w:pageBreakBefore/>
+        <w:spacing w:after="200"/>
+        <w:jc w:val="center"/>
+      </w:pPr>
+      <w:r>
+        <w:t xml:space="preserve">BONAFIDE CERTIFICATE</w:t>
+      </w:r>
+    </w:p>
+    <w:p>
+      <w:pPr>
+        <w:spacing w:after="300"/>
+        <w:jc w:val="center"/>
+      </w:pPr>
+      <w:r>
+        <w:t xml:space="preserve">EASWARI ENGINEERING COLLEGE</w:t>
+      </w:r>
+    </w:p>
+    <w:p>
+      <w:pPr>
+        <w:spacing w:after="600"/>
+        <w:jc w:val="both"/>
+      </w:pPr>
+      <w:r>
+        <w:t xml:space="preserve">Certified that this mini project report titled "HemoVault Centralized Blood Bank Management System" is the bonafide work of Priyan R (Registration Number 310624148072), Department of Computer Science and Engineering (Artificial Intelligence and Machine Learning), who carried out the project work under my supervision.</w:t>
+      </w:r>
+    </w:p>
+    <w:p>
+      <w:pPr>
+        <w:spacing w:after="100"/>
+      </w:pPr>
+      <w:r>
+        <w:t xml:space="preserve">HEAD OF THE DEPARTMENT                                     SUPERVISOR</w:t>
       </w:r>
     </w:p>
     <w:p>
       <w:pPr>
         <w:spacing w:after="50"/>
+      </w:pPr>
+      <w:r>
+        <w:t xml:space="preserve">Dr. Y. Justin Dhas                                         Ms Divyanjali</w:t>
+      </w:r>
+    </w:p>
+    <w:p>
+      <w:pPr>
+        <w:spacing w:after="50"/>
+      </w:pPr>
+      <w:r>
+        <w:t xml:space="preserve">Department of CSE(AIML)                                    Project Guide, Department of CSE(AIML)</w:t>
+      </w:r>
+    </w:p>
+    <w:p>
+      <w:pPr>
+        <w:spacing w:after="400"/>
+      </w:pPr>
+      <w:r>
+        <w:t xml:space="preserve">Easwari Engineering College                                Easwari Engineering College</w:t>
+      </w:r>
+    </w:p>
+    <w:p>
+      <w:pPr>
+        <w:pStyle w:val="Heading1"/>
+        <w:pageBreakBefore/>
+        <w:spacing w:after="200"/>
+        <w:jc w:val="center"/>
+      </w:pPr>
+      <w:r>
+        <w:t xml:space="preserve">CERTIFICATE OF VIVA VOCE EXAMINATION</w:t>
+      </w:r>
+    </w:p>
+    <w:p>
+      <w:pPr>
+        <w:spacing w:after="300"/>
         <w:jc w:val="center"/>
       </w:pPr>
       <w:r>
@@ -69,29 +185,19 @@
     </w:p>
     <w:p>
       <w:pPr>
-        <w:spacing w:after="50"/>
-        <w:jc w:val="center"/>
-      </w:pPr>
-      <w:r>
-        <w:t xml:space="preserve">(AN AUTONOMOUS INSTITUTION) – AFFILIATED TO ANNA UNIVERSITY, CHENNAI</w:t>
+        <w:spacing w:after="600"/>
+        <w:jc w:val="both"/>
+      </w:pPr>
+      <w:r>
+        <w:t xml:space="preserve">This is to certify that the Viva Voce Examination of the project work entitled "HemoVault Centralized Blood Bank Management System", submitted by Mr. Priyan R (Registration Number 310624148072), in partial fulfillment of the requirements for the award of the degree of Bachelor of Engineering, was conducted on ________________ in the Department of Computer Science and Engineering (Artificial Intelligence and Machine Learning), Easwari Engineering College, Ramapuram, Chennai.</w:t>
       </w:r>
     </w:p>
     <w:p>
       <w:pPr>
         <w:spacing w:after="300"/>
-        <w:jc w:val="center"/>
-      </w:pPr>
-      <w:r>
-        <w:t xml:space="preserve">BHARATHI SALAI, RAMAPURAM, CHENNAI – 600 089</w:t>
-      </w:r>
-    </w:p>
-    <w:p>
-      <w:pPr>
-        <w:spacing w:after="400"/>
-        <w:jc w:val="center"/>
-      </w:pPr>
-      <w:r>
-        <w:t xml:space="preserve">APRIL 2026</w:t>
+      </w:pPr>
+      <w:r>
+        <w:t xml:space="preserve">INTERNAL EXAMINER                                         EXTERNAL EXAMINER</w:t>
       </w:r>
     </w:p>
     <w:p>
@@ -102,24 +208,34 @@
         <w:jc w:val="center"/>
       </w:pPr>
       <w:r>
-        <w:t xml:space="preserve">BONAFIDE CERTIFICATE</w:t>
-      </w:r>
-    </w:p>
-    <w:p>
-      <w:pPr>
-        <w:spacing w:after="600"/>
-        <w:jc w:val="both"/>
-      </w:pPr>
-      <w:r>
-        <w:t xml:space="preserve">Certified that this project report titled “HEMOVAULT: CENTRALIZED BLOOD BANK MANAGEMENT SYSTEM” is the Bonafide work of PRIYAN R (Registration No: 310624148072), who carried out the project work under my supervision in partial fulfillment of the requirements for the award of the Degree of Bachelor of Engineering in Computer Science and Engineering (Artificial Intelligence and Machine Learning) of Easwari Engineering College (Autonomous), affiliated to Anna University, Chennai.</w:t>
-      </w:r>
-    </w:p>
-    <w:p>
-      <w:pPr>
-        <w:spacing w:after="100"/>
-      </w:pPr>
-      <w:r>
-        <w:t xml:space="preserve">HEAD OF THE DEPARTMENT                              PROJECT SUPERVISOR</w:t>
+        <w:t xml:space="preserve">ABSTRACT</w:t>
+      </w:r>
+    </w:p>
+    <w:p>
+      <w:pPr>
+        <w:spacing w:after="200"/>
+        <w:jc w:val="both"/>
+      </w:pPr>
+      <w:r>
+        <w:t xml:space="preserve">Healthcare institutions increasingly manage critical transfusion resources through web applications, but a browser-based blood bank platform is dependable only when the system controls who may requisition blood products, how long inventory units remain viable in cold storage, how donor pathology tests are evaluated, and how emergency cross-matching requests are fulfilled. This project develops HemoVault, a centralized full-stack blood bank management platform that lets administrators record blood donations, enforce donor eligibility checks, coordinate multi-hospital emergency requisitions, track blood group stock across eight blood groups, and monitor mandatory diagnostic screenings.</w:t>
+      </w:r>
+    </w:p>
+    <w:p>
+      <w:pPr>
+        <w:spacing w:after="200"/>
+        <w:jc w:val="both"/>
+      </w:pPr>
+      <w:r>
+        <w:t xml:space="preserve">The system uses Node.js and Express on the server, MongoDB with Mongoose for persistent document storage, and a single-page responsive client built with React 18, Vite, and modern CSS. Users sign in through role-based access control, receiving JSON Web Tokens (JWT) stored securely. Passwords are encrypted with bcryptjs salted hashes, and demonstration credentials for Admin, Donor, and Hospital roles are pre-seeded upon database initialization.</w:t>
+      </w:r>
+    </w:p>
+    <w:p>
+      <w:pPr>
+        <w:spacing w:after="300"/>
+        <w:jc w:val="both"/>
+      </w:pPr>
+      <w:r>
+        <w:t xml:space="preserve">A blood donation record represents a physical whole blood or component unit whose expiration date is automatically calculated on the server based on blood component preservation rules. Hospital emergency requisitions are validated against ABO and Rh(D) compatibility matrices, preventing fatal immunological transfusion reactions.</w:t>
       </w:r>
     </w:p>
     <w:p>
@@ -127,7 +243,7 @@
         <w:spacing w:after="400"/>
       </w:pPr>
       <w:r>
-        <w:t xml:space="preserve">Department of CSE (AIML)                            Ms. Divyanjali, Technical Trainer</w:t>
+        <w:t xml:space="preserve">Keywords: blood bank management, transfusion safety, MERN stack, donor eligibility, component preservation, infectious disease screening, hospital emergency requisition, role-based access control</w:t>
       </w:r>
     </w:p>
     <w:p>
@@ -138,25 +254,28 @@
         <w:jc w:val="center"/>
       </w:pPr>
       <w:r>
-        <w:t xml:space="preserve">ABSTRACT</w:t>
-      </w:r>
-    </w:p>
-    <w:p>
-      <w:pPr>
-        <w:spacing w:after="200"/>
-        <w:jc w:val="both"/>
-      </w:pPr>
-      <w:r>
-        <w:t xml:space="preserve">Timely access to safe, compatible blood products is a critical pillar of modern healthcare delivery, emergency resuscitation, and oncological therapy. Conventional blood banking infrastructures in developing and semi-urban regions frequently suffer from severe fragmentation, paper-dependent manual registers, lack of real-time multi-center stock visibility, unmonitored cold-chain shelf-life deterioration, and cumbersome requisition pipelines.</w:t>
-      </w:r>
-    </w:p>
-    <w:p>
-      <w:pPr>
-        <w:spacing w:after="200"/>
-        <w:jc w:val="both"/>
-      </w:pPr>
-      <w:r>
-        <w:t xml:space="preserve">To overcome these systemic vulnerabilities, this project presents HemoVault, a modern, full-stack Centralized Blood Bank Management System architected on the high-performance MERN Stack (MongoDB, Express.js, React.js, and Node.js). HemoVault establishes an unbroken digital custody trail spanning the entire transfusion lifecycle: voluntary donor onboarding, algorithmic clinical vitals assessment, digitized phlebotomy scheduling, mandatory five-marker infectious disease laboratory screening (HIV, Hepatitis B, Hepatitis C, Syphilis, and Malaria), component-level inventory segregation, time-to-live (TTL) expiration tracking, and multi-tier emergency requisition routing.</w:t>
+        <w:t xml:space="preserve">ACKNOWLEDGEMENT</w:t>
+      </w:r>
+    </w:p>
+    <w:p>
+      <w:pPr>
+        <w:spacing w:after="600"/>
+        <w:jc w:val="both"/>
+      </w:pPr>
+      <w:r>
+        <w:t xml:space="preserve">I express my sincere gratitude to the Principal and Management of Easwari Engineering College for giving me the opportunity and the facilities to carry out this project work.
+I convey my heartfelt thanks to Dr. Y. Justin Dhas, Head of the Department of CSE(AIML), for the encouragement and support provided throughout the project.
+The guidance, suggestions and motivation of my project guide, Ms Divyanjali, Department of CSE(AIML), throughout the development of the HemoVault Centralized Blood Bank Management System were of great help.
+I extend my gratitude to the faculty members of the Department of CSE(AIML) for their academic support. I also thank my parents and friends for their encouragement throughout the completion of this project.</w:t>
+      </w:r>
+    </w:p>
+    <w:p>
+      <w:pPr>
+        <w:spacing w:after="400"/>
+        <w:jc w:val="right"/>
+      </w:pPr>
+      <w:r>
+        <w:t xml:space="preserve">Priyan R (310624148072)</w:t>
       </w:r>
     </w:p>
     <w:p>
@@ -171,56 +290,20 @@
     </w:p>
     <w:p>
       <w:pPr>
-        <w:pStyle w:val="Heading2"/>
-        <w:spacing w:after="150"/>
-      </w:pPr>
-      <w:r>
-        <w:t xml:space="preserve">1.1 OVERVIEW OF BLOOD BANKING LOGISTICS</w:t>
-      </w:r>
-    </w:p>
-    <w:p>
-      <w:pPr>
-        <w:spacing w:after="200"/>
-        <w:jc w:val="both"/>
-      </w:pPr>
-      <w:r>
-        <w:t xml:space="preserve">Human blood represents an irreplaceable biological resource essential for clinical survivability across a diverse spectrum of modern medical disciplines. From acute traumatic hemorrhage, emergency obstetric interventions, and complex cardiovascular surgeries to chronic hematological conditions such as thalassemia major, sickle cell anemia, and aggressive oncological chemotherapy, the availability of safe and compatible human blood components is frequently the decisive determinant between patient survival and preventable mortality.</w:t>
-      </w:r>
-    </w:p>
-    <w:p>
-      <w:pPr>
-        <w:pStyle w:val="Heading2"/>
-        <w:spacing w:after="150"/>
-      </w:pPr>
-      <w:r>
-        <w:t xml:space="preserve">1.2 PROBLEM DEFINITION</w:t>
-      </w:r>
-    </w:p>
-    <w:p>
-      <w:pPr>
-        <w:spacing w:after="200"/>
-        <w:jc w:val="both"/>
-      </w:pPr>
-      <w:r>
-        <w:t xml:space="preserve">A comprehensive empirical evaluation of blood bank operations reveals that a majority still rely on manual paper registers, disjointed legacy spreadsheets, or non-networked software utilities. This leads to information asymmetry, severe stock outdating, transcription errors during biological safety screening, and lack of standardized donor eligibility triage.</w:t>
-      </w:r>
-    </w:p>
-    <w:p>
-      <w:pPr>
-        <w:pStyle w:val="Heading2"/>
-        <w:spacing w:after="150"/>
-      </w:pPr>
-      <w:r>
-        <w:t xml:space="preserve">1.3 OBJECTIVES</w:t>
-      </w:r>
-    </w:p>
-    <w:p>
-      <w:pPr>
-        <w:spacing w:after="200"/>
-        <w:jc w:val="both"/>
-      </w:pPr>
-      <w:r>
-        <w:t xml:space="preserve">The primary objectives of HemoVault include real-time multi-portal inventory orchestration, algorithmic clinical eligibility screening, cryptographically enforced laboratory gatekeeping, priority-queue emergency requisition dispatch, and immutable audit logging.</w:t>
+        <w:spacing w:after="400"/>
+        <w:jc w:val="both"/>
+      </w:pPr>
+      <w:r>
+        <w:t xml:space="preserve">1.1 Overview
+Centralized blood banking replaces fragile manual paper ledgers, fragmented hospital logs, and uncoordinated telephone communications with a unified digital repository, real-time inventory tracking, and an automated allocation workflow. That transformation makes the blood donation and requisition process fast, transparent, and auditable, but it also transfers critical clinical responsibilities to software systems. The platform must verify who may requisition blood products, maintain strict temperature and shelf-life tracking so that compromised units are never transfused, validate immunological compatibility without trusting client-side inputs, and record every handling event so hospital blood bank officers can review cold-chain compliance.
+1.2 Problem Definition
+Traditional blood banks in semi-urban and regional clusters rely heavily on manual registers and disparate spreadsheets, creating severe systemic vulnerabilities. Hand-written donor cards are prone to transcription mistakes, physical registers prevent multi-center stock visibility during life-threatening trauma incidents, and expiry dates are tracked through manual visual inspection, leading to tragic discarding of precious blood units.
+1.3 Objective
+The primary objective is to develop a reliable, centralized, and secure digital blood bank management platform for regional health networks. Authorized administrators must be able to manage inventory across all eight blood groups and review infectious disease laboratory tests. Donors must be able to register, verify eligibility criteria, and schedule donations. Partner healthcare facilities must be able to submit emergency blood requisitions and receive real-time compatibility allocations.
+1.4 Scope of the Project
+The project scope encompasses user authentication across three roles (Admin, Donor, Hospital), automated inventory classification for whole blood, packed red cells, platelets, and plasma, donor health questionnaires with dynamic eligibility scoring, a laboratory diagnostic screening portal, emergency requisition management with urgency prioritization, audit logging of all unit transfers, and responsive user interfaces.
+1.5 Motivation
+Every two seconds, a patient requires a life-saving blood transfusion, yet voluntary blood donation centers frequently face severe logistical bottlenecks. Developing a transparent, resilient, and accessible web solution bridges the critical communication gap between voluntary donors, blood banks, and hospital surgical teams.</w:t>
       </w:r>
     </w:p>
     <w:p>
@@ -235,20 +318,16 @@
     </w:p>
     <w:p>
       <w:pPr>
-        <w:pStyle w:val="Heading2"/>
-        <w:spacing w:after="150"/>
-      </w:pPr>
-      <w:r>
-        <w:t xml:space="preserve">2.1 LITERATURE REVIEW</w:t>
-      </w:r>
-    </w:p>
-    <w:p>
-      <w:pPr>
-        <w:spacing w:after="200"/>
-        <w:jc w:val="both"/>
-      </w:pPr>
-      <w:r>
-        <w:t xml:space="preserve">Literature establishes that effective blood management requires three non-negotiable architectural attributes: (1) strict algorithmic enforcement of clinical donor criteria, (2) automated FIFO inventory rotation with proactive TTL expiration sweeps, and (3) an inviolable digital gatekeeper coupling laboratory serological results directly with physical stock release.</w:t>
+        <w:spacing w:after="400"/>
+        <w:jc w:val="both"/>
+      </w:pPr>
+      <w:r>
+        <w:t xml:space="preserve">2.1 Literature Review
+Modern blood banking platforms draw from biomedical informatics, distributed transaction systems, and transfusion logistics research. World Health Organization (WHO) technical guidelines on blood regulatory systems emphasize that traceability, voluntary non-remunerated donation records, and standardized laboratory screening are mandatory prerequisites for preventing transfusion-transmitted infections. National Blood Transfusion Council (NBTC) operational frameworks outline strict donor deferral protocols, specifying minimum 90-day intervals between whole blood donations for males and 120-day intervals for females.
+2.2 Existing System
+Conventional blood bank management in regional facilities typically relies on desktop spreadsheet software or physical paper ledgers. While easy to set up, physical records suffer from severe limitations: real-time stock balances cannot be queried by remote hospital trauma centers, transcription errors frequently corrupt donor records, and tracking expiration dates requires tedious physical inspection of refrigerated blood bags.
+2.3 Proposed System
+The proposed HemoVault platform delivers a lightweight, cloud-deployable solution that centralizes blood bank operations into a unified web application. The platform manages the entire lifecycle of blood units: voluntary donor appointment scheduling, clinical vitals screening, laboratory diagnostic clearance, real-time multi-group inventory tracking, and hospital emergency requisition fulfillment.</w:t>
       </w:r>
     </w:p>
     <w:p>
@@ -263,20 +342,21 @@
     </w:p>
     <w:p>
       <w:pPr>
-        <w:pStyle w:val="Heading2"/>
-        <w:spacing w:after="150"/>
-      </w:pPr>
-      <w:r>
-        <w:t xml:space="preserve">3.1 FUNCTIONAL REQUIREMENTS</w:t>
-      </w:r>
-    </w:p>
-    <w:p>
-      <w:pPr>
-        <w:spacing w:after="200"/>
-        <w:jc w:val="both"/>
-      </w:pPr>
-      <w:r>
-        <w:t xml:space="preserve">Key functional capabilities comprise user authentication via JWT and bcrypt, donor clinical triage (evaluating age, weight, hemoglobin, pulse rate, BP, and donation intervals), phlebotomy intake with serial ID generation, laboratory testing gatekeeping, and multi-tier hospital requisition dispatch.</w:t>
+        <w:spacing w:after="400"/>
+        <w:jc w:val="both"/>
+      </w:pPr>
+      <w:r>
+        <w:t xml:space="preserve">3.1 System Requirements
+Functional requirements are structured around three distinct actor personas (Administrator, Donor, and Hospital) and the core lifecycle of blood units. Authentication must verify credentials, issue signed cryptographic JWT tokens, and authorize access according to user roles before any protected medical resource is returned.
+3.2 Software and Hardware Requirements
+Client: Modern browser with JavaScript enabled.
+Frontend: React 18 with Vite bundling, Lucide-React icons, responsive CSS3.
+Backend: Node.js (v18.x to v24.x LTS) with Express 4.19 framework.
+Database: MongoDB with Mongoose 8.4 ODM.
+Security: Bcryptjs password hashing, JWT authorization.
+Hosting: Vercel serverless platform.
+3.3 Functional Use Cases
+Use cases include User Login, Donor Eligibility Check, Donation Intake, Laboratory Testing, Emergency Requisition, and Stock Balance Query.</w:t>
       </w:r>
     </w:p>
     <w:p>
@@ -291,20 +371,16 @@
     </w:p>
     <w:p>
       <w:pPr>
-        <w:pStyle w:val="Heading2"/>
-        <w:spacing w:after="150"/>
-      </w:pPr>
-      <w:r>
-        <w:t xml:space="preserve">4.1 SYSTEM ARCHITECTURE</w:t>
-      </w:r>
-    </w:p>
-    <w:p>
-      <w:pPr>
-        <w:spacing w:after="200"/>
-        <w:jc w:val="both"/>
-      </w:pPr>
-      <w:r>
-        <w:t xml:space="preserve">HemoVault is architected on a 3-tier model consisting of a React 18 SPA presentation layer, an Express.js/Node.js API gateway and controller tier, and a MongoDB / MongoMemoryServer persistence layer.</w:t>
+        <w:spacing w:after="400"/>
+        <w:jc w:val="both"/>
+      </w:pPr>
+      <w:r>
+        <w:t xml:space="preserve">4.1 System Architecture
+HemoVault is engineered as a decoupled, multi-tier web application adhering to the Model-View-Controller (MVC) paradigm. The presentation tier consists of a responsive Single Page Application (SPA) developed with React 18 and bundled via Vite. The presentation layer communicates with the backend application tier via asynchronous RESTful JSON HTTP requests.
+4.2 Module Description
+Modules include Authentication, Donor Management, Blood Inventory, Pathology Testing, Emergency Requisitions, and Analytics &amp; Audit.
+4.3 Data Model and Database Schema
+The MongoDB document schema comprises six primary collections: Users, Donors, BloodInventory, EmergencyRequests, TestingLabs, and AuditLogs.</w:t>
       </w:r>
     </w:p>
     <w:p>
@@ -319,20 +395,18 @@
     </w:p>
     <w:p>
       <w:pPr>
-        <w:pStyle w:val="Heading2"/>
-        <w:spacing w:after="150"/>
-      </w:pPr>
-      <w:r>
-        <w:t xml:space="preserve">5.1 IMPLEMENTATION OVERVIEW</w:t>
-      </w:r>
-    </w:p>
-    <w:p>
-      <w:pPr>
-        <w:spacing w:after="200"/>
-        <w:jc w:val="both"/>
-      </w:pPr>
-      <w:r>
-        <w:t xml:space="preserve">Full-stack implementation details covering db.js smart connection fallback, User.js pre-save bcrypt hashing, auth.js JWT protection, eligibility.js clinical rules, testingController.js gatekeeper logic, requestController.js FIFO allocation, and api.js Axios interceptors.</w:t>
+        <w:spacing w:after="400"/>
+        <w:jc w:val="both"/>
+      </w:pPr>
+      <w:r>
+        <w:t xml:space="preserve">5.1 Implementation Overview
+The backend is implemented in Node.js and Express, organizing controllers, models, and routes. The frontend is built with React 18, Vite, and Axios for centralized API communications.
+5.2 Key Functions and Code Explanation
+Includes bcrypt password encryption, JWT authentication middleware, donor eligibility evaluation, blood component shelf-life calculation, laboratory 5-pathogen screening, and emergency ABO/Rh compatibility allocation.
+5.3 End to End Donor Registration &amp; Donation Workflow
+Details donor registration, health questionnaires, vitals assessment, phlebotomy scheduling, and post-donation recovery.
+5.4 Hospital Emergency Requisition Workflow
+Details requisition submission, priority queue placement, compatible stock identification, admin approval, and courier dispatch.</w:t>
       </w:r>
     </w:p>
     <w:p>
@@ -342,16 +416,21 @@
         <w:spacing w:after="200"/>
       </w:pPr>
       <w:r>
-        <w:t xml:space="preserve">CHAPTER 6: CONCLUSION &amp; FUTURE WORK</w:t>
-      </w:r>
-    </w:p>
-    <w:p>
-      <w:pPr>
-        <w:spacing w:after="200"/>
-        <w:jc w:val="both"/>
-      </w:pPr>
-      <w:r>
-        <w:t xml:space="preserve">HemoVault delivers a verified, resilient, and enterprise-grade healthcare management solution. Future enhancements encompass AI-driven predictive demand forecasting, IoT smart refrigerator telemetry, autonomous drone delivery integration, and blockchain-based hemovigilance auditing.</w:t>
+        <w:t xml:space="preserve">CHAPTER 6: CONCLUSION AND FUTURE WORK</w:t>
+      </w:r>
+    </w:p>
+    <w:p>
+      <w:pPr>
+        <w:spacing w:after="400"/>
+        <w:jc w:val="both"/>
+      </w:pPr>
+      <w:r>
+        <w:t xml:space="preserve">6.1 Conclusion
+The HemoVault Centralized Blood Bank Management System demonstrates a reliable, auditable, and resilient full-stack web application designed for regional healthcare networks. By combining modern MERN technologies with rigorous clinical safety rules, the platform resolves systemic vulnerabilities inherent in manual registers and disconnected hospital communications.
+6.2 Future Enhancements
+Future roadmap enhancements include automated donor SMS/email alerts, barcode/RFID blood bag scanning, hospital EHR HL7/FHIR integration, and predictive inventory forecasting.
+GitHub Repository:
+https://github.com/priyan071/blood-banks-management-system</w:t>
       </w:r>
     </w:p>
     <w:p>
@@ -370,9 +449,16 @@
         <w:jc w:val="both"/>
       </w:pPr>
       <w:r>
-        <w:t xml:space="preserve">1. World Health Organization, "Action Framework to Advance Universal Access to Safe, Effective and Quality-Assured Blood Products 2020–2023," Geneva: WHO, 2020.
-2. National Blood Transfusion Council (NBTC), "Standards for Blood Banks and Blood Transfusion Services," New Delhi, 2017.
-3. G. P. Prastacos, "Blood Inventory Management: An Overview of Theory and Practice," Management Science, vol. 30, no. 7, pp. 777–800, 1984.</w:t>
+        <w:t xml:space="preserve">[1] World Health Organization. Requirements for the Collection, Processing and Quality Control of Blood, Blood Components and Plasma Derivatives. WHO Technical Report Series, Geneva, 2021.
+[2] National Blood Transfusion Council. Standards for Blood Banks and Blood Transfusion Services. Ministry of Health and Family Welfare, Government of India, New Delhi, 2022.
+[3] Express.js Documentation. Routing and Middleware Architecture. https://expressjs.com/en/guide/routing.html, 2026.
+[4] OWASP Foundation. REST Security and Authentication Cheat Sheet Series. https://cheatsheetseries.owasp.org/, 2025.
+[5] MongoDB Documentation. Schema Design, Document Indexing, and Transaction Management. https://www.mongodb.com/docs/, 2026.
+[6] Mongoose ODM. Schema Validation, Middleware Hooks, and Population. https://mongoosejs.com/docs/, 2026.
+[7] React Documentation. Components, Hooks, State Management, and Virtual DOM. https://react.dev/, 2026.
+[8] Vite Documentation. Fast Frontend Tooling and Hot Module Replacement. https://vite.dev/, 2026.
+[9] Vercel Documentation. Serverless Functions, Routing Rewrites, and Monorepo Deployments. https://vercel.com/docs, 2026.
+[10] JSON Web Token (JWT). RFC 7519: JSON Web Token Architecture. Internet Engineering Task Force (IETF), https://jwt.io/, 2024.</w:t>
       </w:r>
     </w:p>
     <w:sectPr>

</xml_diff>